<commit_message>
updated forest plots, updated intros
</commit_message>
<xml_diff>
--- a/output/tables/04.Table1_sample_full.docx
+++ b/output/tables/04.Table1_sample_full.docx
@@ -974,19 +974,19 @@
               <w:rPr>
                 <w:rFonts w:ascii="Calibri" w:hAnsi="Calibri" w:eastAsia="Calibri" w:cs="Calibri"/>
                 <w:i w:val="false"/>
-                <w:b w:val="false"/>
-                <w:u w:val="none"/>
-                <w:strike w:val="false"/>
-                <w:sz w:val="20"/>
-                <w:szCs w:val="20"/>
-                <w:color w:val="000000"/>
-              </w:rPr>
-            </w:pPr>
-            <w:r>
-              <w:rPr>
-                <w:rFonts w:ascii="Calibri" w:hAnsi="Calibri" w:eastAsia="Calibri" w:cs="Calibri"/>
-                <w:i w:val="false"/>
-                <w:b w:val="false"/>
+                <w:b w:val="true"/>
+                <w:u w:val="none"/>
+                <w:strike w:val="false"/>
+                <w:sz w:val="20"/>
+                <w:szCs w:val="20"/>
+                <w:color w:val="000000"/>
+              </w:rPr>
+            </w:pPr>
+            <w:r>
+              <w:rPr>
+                <w:rFonts w:ascii="Calibri" w:hAnsi="Calibri" w:eastAsia="Calibri" w:cs="Calibri"/>
+                <w:i w:val="false"/>
+                <w:b w:val="true"/>
                 <w:u w:val="none"/>
                 <w:strike w:val="false"/>
                 <w:sz w:val="20"/>
@@ -1644,19 +1644,19 @@
               <w:rPr>
                 <w:rFonts w:ascii="Calibri" w:hAnsi="Calibri" w:eastAsia="Calibri" w:cs="Calibri"/>
                 <w:i w:val="false"/>
-                <w:b w:val="false"/>
-                <w:u w:val="none"/>
-                <w:strike w:val="false"/>
-                <w:sz w:val="20"/>
-                <w:szCs w:val="20"/>
-                <w:color w:val="000000"/>
-              </w:rPr>
-            </w:pPr>
-            <w:r>
-              <w:rPr>
-                <w:rFonts w:ascii="Calibri" w:hAnsi="Calibri" w:eastAsia="Calibri" w:cs="Calibri"/>
-                <w:i w:val="false"/>
-                <w:b w:val="false"/>
+                <w:b w:val="true"/>
+                <w:u w:val="none"/>
+                <w:strike w:val="false"/>
+                <w:sz w:val="20"/>
+                <w:szCs w:val="20"/>
+                <w:color w:val="000000"/>
+              </w:rPr>
+            </w:pPr>
+            <w:r>
+              <w:rPr>
+                <w:rFonts w:ascii="Calibri" w:hAnsi="Calibri" w:eastAsia="Calibri" w:cs="Calibri"/>
+                <w:i w:val="false"/>
+                <w:b w:val="true"/>
                 <w:u w:val="none"/>
                 <w:strike w:val="false"/>
                 <w:sz w:val="20"/>
@@ -2314,19 +2314,19 @@
               <w:rPr>
                 <w:rFonts w:ascii="Calibri" w:hAnsi="Calibri" w:eastAsia="Calibri" w:cs="Calibri"/>
                 <w:i w:val="false"/>
-                <w:b w:val="false"/>
-                <w:u w:val="none"/>
-                <w:strike w:val="false"/>
-                <w:sz w:val="20"/>
-                <w:szCs w:val="20"/>
-                <w:color w:val="000000"/>
-              </w:rPr>
-            </w:pPr>
-            <w:r>
-              <w:rPr>
-                <w:rFonts w:ascii="Calibri" w:hAnsi="Calibri" w:eastAsia="Calibri" w:cs="Calibri"/>
-                <w:i w:val="false"/>
-                <w:b w:val="false"/>
+                <w:b w:val="true"/>
+                <w:u w:val="none"/>
+                <w:strike w:val="false"/>
+                <w:sz w:val="20"/>
+                <w:szCs w:val="20"/>
+                <w:color w:val="000000"/>
+              </w:rPr>
+            </w:pPr>
+            <w:r>
+              <w:rPr>
+                <w:rFonts w:ascii="Calibri" w:hAnsi="Calibri" w:eastAsia="Calibri" w:cs="Calibri"/>
+                <w:i w:val="false"/>
+                <w:b w:val="true"/>
                 <w:u w:val="none"/>
                 <w:strike w:val="false"/>
                 <w:sz w:val="20"/>
@@ -4994,19 +4994,19 @@
               <w:rPr>
                 <w:rFonts w:ascii="Calibri" w:hAnsi="Calibri" w:eastAsia="Calibri" w:cs="Calibri"/>
                 <w:i w:val="false"/>
-                <w:b w:val="false"/>
-                <w:u w:val="none"/>
-                <w:strike w:val="false"/>
-                <w:sz w:val="20"/>
-                <w:szCs w:val="20"/>
-                <w:color w:val="000000"/>
-              </w:rPr>
-            </w:pPr>
-            <w:r>
-              <w:rPr>
-                <w:rFonts w:ascii="Calibri" w:hAnsi="Calibri" w:eastAsia="Calibri" w:cs="Calibri"/>
-                <w:i w:val="false"/>
-                <w:b w:val="false"/>
+                <w:b w:val="true"/>
+                <w:u w:val="none"/>
+                <w:strike w:val="false"/>
+                <w:sz w:val="20"/>
+                <w:szCs w:val="20"/>
+                <w:color w:val="000000"/>
+              </w:rPr>
+            </w:pPr>
+            <w:r>
+              <w:rPr>
+                <w:rFonts w:ascii="Calibri" w:hAnsi="Calibri" w:eastAsia="Calibri" w:cs="Calibri"/>
+                <w:i w:val="false"/>
+                <w:b w:val="true"/>
                 <w:u w:val="none"/>
                 <w:strike w:val="false"/>
                 <w:sz w:val="20"/>
@@ -8009,19 +8009,19 @@
               <w:rPr>
                 <w:rFonts w:ascii="Calibri" w:hAnsi="Calibri" w:eastAsia="Calibri" w:cs="Calibri"/>
                 <w:i w:val="false"/>
-                <w:b w:val="false"/>
-                <w:u w:val="none"/>
-                <w:strike w:val="false"/>
-                <w:sz w:val="20"/>
-                <w:szCs w:val="20"/>
-                <w:color w:val="000000"/>
-              </w:rPr>
-            </w:pPr>
-            <w:r>
-              <w:rPr>
-                <w:rFonts w:ascii="Calibri" w:hAnsi="Calibri" w:eastAsia="Calibri" w:cs="Calibri"/>
-                <w:i w:val="false"/>
-                <w:b w:val="false"/>
+                <w:b w:val="true"/>
+                <w:u w:val="none"/>
+                <w:strike w:val="false"/>
+                <w:sz w:val="20"/>
+                <w:szCs w:val="20"/>
+                <w:color w:val="000000"/>
+              </w:rPr>
+            </w:pPr>
+            <w:r>
+              <w:rPr>
+                <w:rFonts w:ascii="Calibri" w:hAnsi="Calibri" w:eastAsia="Calibri" w:cs="Calibri"/>
+                <w:i w:val="false"/>
+                <w:b w:val="true"/>
                 <w:u w:val="none"/>
                 <w:strike w:val="false"/>
                 <w:sz w:val="20"/>
@@ -10019,19 +10019,19 @@
               <w:rPr>
                 <w:rFonts w:ascii="Calibri" w:hAnsi="Calibri" w:eastAsia="Calibri" w:cs="Calibri"/>
                 <w:i w:val="false"/>
-                <w:b w:val="false"/>
-                <w:u w:val="none"/>
-                <w:strike w:val="false"/>
-                <w:sz w:val="20"/>
-                <w:szCs w:val="20"/>
-                <w:color w:val="000000"/>
-              </w:rPr>
-            </w:pPr>
-            <w:r>
-              <w:rPr>
-                <w:rFonts w:ascii="Calibri" w:hAnsi="Calibri" w:eastAsia="Calibri" w:cs="Calibri"/>
-                <w:i w:val="false"/>
-                <w:b w:val="false"/>
+                <w:b w:val="true"/>
+                <w:u w:val="none"/>
+                <w:strike w:val="false"/>
+                <w:sz w:val="20"/>
+                <w:szCs w:val="20"/>
+                <w:color w:val="000000"/>
+              </w:rPr>
+            </w:pPr>
+            <w:r>
+              <w:rPr>
+                <w:rFonts w:ascii="Calibri" w:hAnsi="Calibri" w:eastAsia="Calibri" w:cs="Calibri"/>
+                <w:i w:val="false"/>
+                <w:b w:val="true"/>
                 <w:u w:val="none"/>
                 <w:strike w:val="false"/>
                 <w:sz w:val="20"/>
@@ -16719,19 +16719,19 @@
               <w:rPr>
                 <w:rFonts w:ascii="Calibri" w:hAnsi="Calibri" w:eastAsia="Calibri" w:cs="Calibri"/>
                 <w:i w:val="false"/>
-                <w:b w:val="false"/>
-                <w:u w:val="none"/>
-                <w:strike w:val="false"/>
-                <w:sz w:val="20"/>
-                <w:szCs w:val="20"/>
-                <w:color w:val="000000"/>
-              </w:rPr>
-            </w:pPr>
-            <w:r>
-              <w:rPr>
-                <w:rFonts w:ascii="Calibri" w:hAnsi="Calibri" w:eastAsia="Calibri" w:cs="Calibri"/>
-                <w:i w:val="false"/>
-                <w:b w:val="false"/>
+                <w:b w:val="true"/>
+                <w:u w:val="none"/>
+                <w:strike w:val="false"/>
+                <w:sz w:val="20"/>
+                <w:szCs w:val="20"/>
+                <w:color w:val="000000"/>
+              </w:rPr>
+            </w:pPr>
+            <w:r>
+              <w:rPr>
+                <w:rFonts w:ascii="Calibri" w:hAnsi="Calibri" w:eastAsia="Calibri" w:cs="Calibri"/>
+                <w:i w:val="false"/>
+                <w:b w:val="true"/>
                 <w:u w:val="none"/>
                 <w:strike w:val="false"/>
                 <w:sz w:val="20"/>

</xml_diff>